<commit_message>
docs: add Real Edge section to Features doc — honest assessment + 6 edge-building features
Co-Authored-By: Claude Sonnet 4.6 <noreply@anthropic.com>
</commit_message>
<xml_diff>
--- a/Trading_Agent_Features.docx
+++ b/Trading_Agent_Features.docx
@@ -6843,7 +6843,1246 @@
         <w:rPr>
           <w:color w:val="1A3A6A"/>
         </w:rPr>
-        <w:t>9. Priority Summary — What to Build Next</w:t>
+        <w:t>9. Real Edge — Building Durable Competitive Advantage</w:t>
+      </w:r>
+    </w:p>
+    <w:p>
+      <w:pPr>
+        <w:spacing w:after="120"/>
+      </w:pPr>
+      <w:r>
+        <w:t>Honest assessment of where the current system has edge — and where it does not — and what to build to create genuine, durable advantage over commodity signals.</w:t>
+      </w:r>
+    </w:p>
+    <w:p>
+      <w:pPr>
+        <w:pStyle w:val="Heading2"/>
+      </w:pPr>
+      <w:r>
+        <w:rPr>
+          <w:color w:val="1A3A6A"/>
+        </w:rPr>
+        <w:t>Why Current Signals Have No Edge</w:t>
+      </w:r>
+    </w:p>
+    <w:p>
+      <w:pPr>
+        <w:spacing w:after="120"/>
+      </w:pPr>
+      <w:r>
+        <w:t>RSI, MACD, and Bollinger Bands are in every trading textbook and every retail platform. Quant funds run the same signals at microsecond speed with better fills. By the time yfinance shows a signal (15-min delayed), it is already partially priced in. Commodity signals + delayed data = no structural advantage. The current system's real value is in its risk management discipline (3:1 R:R, stop-loss, sector caps, position sizing) — not its signal intelligence.</w:t>
+      </w:r>
+    </w:p>
+    <w:p>
+      <w:pPr>
+        <w:pStyle w:val="Heading2"/>
+      </w:pPr>
+      <w:r>
+        <w:rPr>
+          <w:color w:val="1A3A6A"/>
+        </w:rPr>
+        <w:t>Where Retail Can Actually Win</w:t>
+      </w:r>
+    </w:p>
+    <w:p>
+      <w:pPr>
+        <w:spacing w:after="120"/>
+      </w:pPr>
+      <w:r>
+        <w:t>Large hedge funds cannot exploit small-cap opportunities — $10M minimum position sizes make many universe tickers untradeable for institutional money. A focused system exploiting stock-specific catalysts and alternative data can find edge that institutional capital ignores by design. The goal is information asymmetry at the stock level, not speed.</w:t>
+      </w:r>
+    </w:p>
+    <w:p>
+      <w:pPr>
+        <w:pStyle w:val="Heading2"/>
+      </w:pPr>
+      <w:r>
+        <w:rPr>
+          <w:color w:val="1A3A6A"/>
+        </w:rPr>
+        <w:t>Honest Confidence Assessment</w:t>
+      </w:r>
+    </w:p>
+    <w:tbl>
+      <w:tblPr>
+        <w:tblStyle w:val="TableGrid"/>
+        <w:tblW w:type="auto" w:w="0"/>
+        <w:tblLook w:firstColumn="1" w:firstRow="1" w:lastColumn="0" w:lastRow="0" w:noHBand="0" w:noVBand="1" w:val="04A0"/>
+      </w:tblPr>
+      <w:tblGrid>
+        <w:gridCol w:w="2880"/>
+        <w:gridCol w:w="2880"/>
+        <w:gridCol w:w="2880"/>
+      </w:tblGrid>
+      <w:tr>
+        <w:tc>
+          <w:tcPr>
+            <w:tcW w:type="dxa" w:w="2880"/>
+          </w:tcPr>
+          <w:p>
+            <w:r>
+              <w:rPr>
+                <w:b/>
+              </w:rPr>
+              <w:t>Scenario</w:t>
+            </w:r>
+          </w:p>
+        </w:tc>
+        <w:tc>
+          <w:tcPr>
+            <w:tcW w:type="dxa" w:w="2880"/>
+          </w:tcPr>
+          <w:p>
+            <w:r>
+              <w:rPr>
+                <w:b/>
+              </w:rPr>
+              <w:t>Expected Daily P&amp;L</w:t>
+            </w:r>
+          </w:p>
+        </w:tc>
+        <w:tc>
+          <w:tcPr>
+            <w:tcW w:type="dxa" w:w="2880"/>
+          </w:tcPr>
+          <w:p>
+            <w:r>
+              <w:rPr>
+                <w:b/>
+              </w:rPr>
+              <w:t>Notes</w:t>
+            </w:r>
+          </w:p>
+        </w:tc>
+      </w:tr>
+      <w:tr>
+        <w:tc>
+          <w:tcPr>
+            <w:tcW w:type="dxa" w:w="2880"/>
+          </w:tcPr>
+          <w:p/>
+        </w:tc>
+        <w:tc>
+          <w:tcPr>
+            <w:tcW w:type="dxa" w:w="2880"/>
+          </w:tcPr>
+          <w:p/>
+        </w:tc>
+        <w:tc>
+          <w:tcPr>
+            <w:tcW w:type="dxa" w:w="2880"/>
+          </w:tcPr>
+          <w:p/>
+        </w:tc>
+      </w:tr>
+      <w:tr>
+        <w:tc>
+          <w:tcPr>
+            <w:tcW w:type="dxa" w:w="2880"/>
+          </w:tcPr>
+          <w:p/>
+        </w:tc>
+        <w:tc>
+          <w:tcPr>
+            <w:tcW w:type="dxa" w:w="2880"/>
+          </w:tcPr>
+          <w:p/>
+        </w:tc>
+        <w:tc>
+          <w:tcPr>
+            <w:tcW w:type="dxa" w:w="2880"/>
+          </w:tcPr>
+          <w:p/>
+        </w:tc>
+      </w:tr>
+      <w:tr>
+        <w:tc>
+          <w:tcPr>
+            <w:tcW w:type="dxa" w:w="2880"/>
+          </w:tcPr>
+          <w:p/>
+        </w:tc>
+        <w:tc>
+          <w:tcPr>
+            <w:tcW w:type="dxa" w:w="2880"/>
+          </w:tcPr>
+          <w:p/>
+        </w:tc>
+        <w:tc>
+          <w:tcPr>
+            <w:tcW w:type="dxa" w:w="2880"/>
+          </w:tcPr>
+          <w:p/>
+        </w:tc>
+      </w:tr>
+      <w:tr>
+        <w:tc>
+          <w:tcPr>
+            <w:tcW w:type="dxa" w:w="2880"/>
+          </w:tcPr>
+          <w:p/>
+        </w:tc>
+        <w:tc>
+          <w:tcPr>
+            <w:tcW w:type="dxa" w:w="2880"/>
+          </w:tcPr>
+          <w:p/>
+        </w:tc>
+        <w:tc>
+          <w:tcPr>
+            <w:tcW w:type="dxa" w:w="2880"/>
+          </w:tcPr>
+          <w:p/>
+        </w:tc>
+      </w:tr>
+      <w:tr>
+        <w:tc>
+          <w:tcPr>
+            <w:tcW w:type="dxa" w:w="2880"/>
+          </w:tcPr>
+          <w:p/>
+        </w:tc>
+        <w:tc>
+          <w:tcPr>
+            <w:tcW w:type="dxa" w:w="2880"/>
+          </w:tcPr>
+          <w:p/>
+        </w:tc>
+        <w:tc>
+          <w:tcPr>
+            <w:tcW w:type="dxa" w:w="2880"/>
+          </w:tcPr>
+          <w:p/>
+        </w:tc>
+      </w:tr>
+      <w:tr>
+        <w:tc>
+          <w:tcPr>
+            <w:tcW w:type="dxa" w:w="2880"/>
+          </w:tcPr>
+          <w:p>
+            <w:r>
+              <w:t>Paper trading, bull market</w:t>
+            </w:r>
+          </w:p>
+        </w:tc>
+        <w:tc>
+          <w:tcPr>
+            <w:tcW w:type="dxa" w:w="2880"/>
+          </w:tcPr>
+          <w:p>
+            <w:r>
+              <w:t>$500–750</w:t>
+            </w:r>
+          </w:p>
+        </w:tc>
+        <w:tc>
+          <w:tcPr>
+            <w:tcW w:type="dxa" w:w="2880"/>
+          </w:tcPr>
+          <w:p>
+            <w:r>
+              <w:t>Close to 30-day backtest — favorable conditions</w:t>
+            </w:r>
+          </w:p>
+        </w:tc>
+      </w:tr>
+      <w:tr>
+        <w:tc>
+          <w:tcPr>
+            <w:tcW w:type="dxa" w:w="2880"/>
+          </w:tcPr>
+          <w:p>
+            <w:r>
+              <w:t>Paper trading, choppy market</w:t>
+            </w:r>
+          </w:p>
+        </w:tc>
+        <w:tc>
+          <w:tcPr>
+            <w:tcW w:type="dxa" w:w="2880"/>
+          </w:tcPr>
+          <w:p>
+            <w:r>
+              <w:t>$0–200, some losses</w:t>
+            </w:r>
+          </w:p>
+        </w:tc>
+        <w:tc>
+          <w:tcPr>
+            <w:tcW w:type="dxa" w:w="2880"/>
+          </w:tcPr>
+          <w:p>
+            <w:r>
+              <w:t>Momentum signals fail in sideways/mean-reverting markets</w:t>
+            </w:r>
+          </w:p>
+        </w:tc>
+      </w:tr>
+      <w:tr>
+        <w:tc>
+          <w:tcPr>
+            <w:tcW w:type="dxa" w:w="2880"/>
+          </w:tcPr>
+          <w:p>
+            <w:r>
+              <w:t>Real money, bull market</w:t>
+            </w:r>
+          </w:p>
+        </w:tc>
+        <w:tc>
+          <w:tcPr>
+            <w:tcW w:type="dxa" w:w="2880"/>
+          </w:tcPr>
+          <w:p>
+            <w:r>
+              <w:t>$200–400</w:t>
+            </w:r>
+          </w:p>
+        </w:tc>
+        <w:tc>
+          <w:tcPr>
+            <w:tcW w:type="dxa" w:w="2880"/>
+          </w:tcPr>
+          <w:p>
+            <w:r>
+              <w:t>~40% haircut from slippage, spreads, partial fills</w:t>
+            </w:r>
+          </w:p>
+        </w:tc>
+      </w:tr>
+      <w:tr>
+        <w:tc>
+          <w:tcPr>
+            <w:tcW w:type="dxa" w:w="2880"/>
+          </w:tcPr>
+          <w:p>
+            <w:r>
+              <w:t>Real money, choppy market</w:t>
+            </w:r>
+          </w:p>
+        </w:tc>
+        <w:tc>
+          <w:tcPr>
+            <w:tcW w:type="dxa" w:w="2880"/>
+          </w:tcPr>
+          <w:p>
+            <w:r>
+              <w:t>Breakeven to -loss</w:t>
+            </w:r>
+          </w:p>
+        </w:tc>
+        <w:tc>
+          <w:tcPr>
+            <w:tcW w:type="dxa" w:w="2880"/>
+          </w:tcPr>
+          <w:p>
+            <w:r>
+              <w:t>No edge on non-trending days with current signals</w:t>
+            </w:r>
+          </w:p>
+        </w:tc>
+      </w:tr>
+      <w:tr>
+        <w:tc>
+          <w:tcPr>
+            <w:tcW w:type="dxa" w:w="2880"/>
+          </w:tcPr>
+          <w:p>
+            <w:r>
+              <w:t>Real money, volatility spike</w:t>
+            </w:r>
+          </w:p>
+        </w:tc>
+        <w:tc>
+          <w:tcPr>
+            <w:tcW w:type="dxa" w:w="2880"/>
+          </w:tcPr>
+          <w:p>
+            <w:r>
+              <w:t>Reduced but protected</w:t>
+            </w:r>
+          </w:p>
+        </w:tc>
+        <w:tc>
+          <w:tcPr>
+            <w:tcW w:type="dxa" w:w="2880"/>
+          </w:tcPr>
+          <w:p>
+            <w:r>
+              <w:t>VIX gates reduce position count — good design</w:t>
+            </w:r>
+          </w:p>
+        </w:tc>
+      </w:tr>
+    </w:tbl>
+    <w:p/>
+    <w:p>
+      <w:pPr>
+        <w:spacing w:after="120"/>
+      </w:pPr>
+      <w:r>
+        <w:t>Overall confidence: 6/10 paper, 4/10 real money with current signals only.</w:t>
+      </w:r>
+    </w:p>
+    <w:p>
+      <w:pPr>
+        <w:pStyle w:val="Heading2"/>
+      </w:pPr>
+      <w:r>
+        <w:rPr>
+          <w:color w:val="1A3A6A"/>
+        </w:rPr>
+        <w:t>Features That Create Real Edge</w:t>
+      </w:r>
+    </w:p>
+    <w:p>
+      <w:pPr>
+        <w:spacing w:after="120"/>
+      </w:pPr>
+      <w:r>
+        <w:t>Ranked by signal quality and buildability. Each addresses a specific gap in the current system.</w:t>
+      </w:r>
+    </w:p>
+    <w:tbl>
+      <w:tblPr>
+        <w:tblStyle w:val="TableGrid"/>
+        <w:tblW w:type="auto" w:w="0"/>
+        <w:tblLook w:firstColumn="1" w:firstRow="1" w:lastColumn="0" w:lastRow="0" w:noHBand="0" w:noVBand="1" w:val="04A0"/>
+      </w:tblPr>
+      <w:tblGrid>
+        <w:gridCol w:w="1234"/>
+        <w:gridCol w:w="1234"/>
+        <w:gridCol w:w="1234"/>
+        <w:gridCol w:w="1234"/>
+        <w:gridCol w:w="1234"/>
+        <w:gridCol w:w="1234"/>
+        <w:gridCol w:w="1234"/>
+      </w:tblGrid>
+      <w:tr>
+        <w:tc>
+          <w:tcPr>
+            <w:tcW w:type="dxa" w:w="1234"/>
+          </w:tcPr>
+          <w:p>
+            <w:r>
+              <w:rPr>
+                <w:b/>
+              </w:rPr>
+              <w:t>Priority</w:t>
+            </w:r>
+          </w:p>
+        </w:tc>
+        <w:tc>
+          <w:tcPr>
+            <w:tcW w:type="dxa" w:w="1234"/>
+          </w:tcPr>
+          <w:p>
+            <w:r>
+              <w:rPr>
+                <w:b/>
+              </w:rPr>
+              <w:t>Feature</w:t>
+            </w:r>
+          </w:p>
+        </w:tc>
+        <w:tc>
+          <w:tcPr>
+            <w:tcW w:type="dxa" w:w="1234"/>
+          </w:tcPr>
+          <w:p>
+            <w:r>
+              <w:rPr>
+                <w:b/>
+              </w:rPr>
+              <w:t>Edge Type</w:t>
+            </w:r>
+          </w:p>
+        </w:tc>
+        <w:tc>
+          <w:tcPr>
+            <w:tcW w:type="dxa" w:w="1234"/>
+          </w:tcPr>
+          <w:p>
+            <w:r>
+              <w:rPr>
+                <w:b/>
+              </w:rPr>
+              <w:t>What</w:t>
+            </w:r>
+          </w:p>
+        </w:tc>
+        <w:tc>
+          <w:tcPr>
+            <w:tcW w:type="dxa" w:w="1234"/>
+          </w:tcPr>
+          <w:p>
+            <w:r>
+              <w:rPr>
+                <w:b/>
+              </w:rPr>
+              <w:t>Why It Works</w:t>
+            </w:r>
+          </w:p>
+        </w:tc>
+        <w:tc>
+          <w:tcPr>
+            <w:tcW w:type="dxa" w:w="1234"/>
+          </w:tcPr>
+          <w:p>
+            <w:r>
+              <w:rPr>
+                <w:b/>
+              </w:rPr>
+              <w:t>Effort</w:t>
+            </w:r>
+          </w:p>
+        </w:tc>
+        <w:tc>
+          <w:tcPr>
+            <w:tcW w:type="dxa" w:w="1234"/>
+          </w:tcPr>
+          <w:p>
+            <w:r>
+              <w:rPr>
+                <w:b/>
+              </w:rPr>
+              <w:t>Status</w:t>
+            </w:r>
+          </w:p>
+        </w:tc>
+      </w:tr>
+      <w:tr>
+        <w:tc>
+          <w:tcPr>
+            <w:tcW w:type="dxa" w:w="1234"/>
+          </w:tcPr>
+          <w:p/>
+        </w:tc>
+        <w:tc>
+          <w:tcPr>
+            <w:tcW w:type="dxa" w:w="1234"/>
+          </w:tcPr>
+          <w:p/>
+        </w:tc>
+        <w:tc>
+          <w:tcPr>
+            <w:tcW w:type="dxa" w:w="1234"/>
+          </w:tcPr>
+          <w:p/>
+        </w:tc>
+        <w:tc>
+          <w:tcPr>
+            <w:tcW w:type="dxa" w:w="1234"/>
+          </w:tcPr>
+          <w:p/>
+        </w:tc>
+        <w:tc>
+          <w:tcPr>
+            <w:tcW w:type="dxa" w:w="1234"/>
+          </w:tcPr>
+          <w:p/>
+        </w:tc>
+        <w:tc>
+          <w:tcPr>
+            <w:tcW w:type="dxa" w:w="1234"/>
+          </w:tcPr>
+          <w:p/>
+        </w:tc>
+        <w:tc>
+          <w:tcPr>
+            <w:tcW w:type="dxa" w:w="1234"/>
+          </w:tcPr>
+          <w:p/>
+        </w:tc>
+      </w:tr>
+      <w:tr>
+        <w:tc>
+          <w:tcPr>
+            <w:tcW w:type="dxa" w:w="1234"/>
+          </w:tcPr>
+          <w:p/>
+        </w:tc>
+        <w:tc>
+          <w:tcPr>
+            <w:tcW w:type="dxa" w:w="1234"/>
+          </w:tcPr>
+          <w:p/>
+        </w:tc>
+        <w:tc>
+          <w:tcPr>
+            <w:tcW w:type="dxa" w:w="1234"/>
+          </w:tcPr>
+          <w:p/>
+        </w:tc>
+        <w:tc>
+          <w:tcPr>
+            <w:tcW w:type="dxa" w:w="1234"/>
+          </w:tcPr>
+          <w:p/>
+        </w:tc>
+        <w:tc>
+          <w:tcPr>
+            <w:tcW w:type="dxa" w:w="1234"/>
+          </w:tcPr>
+          <w:p/>
+        </w:tc>
+        <w:tc>
+          <w:tcPr>
+            <w:tcW w:type="dxa" w:w="1234"/>
+          </w:tcPr>
+          <w:p/>
+        </w:tc>
+        <w:tc>
+          <w:tcPr>
+            <w:tcW w:type="dxa" w:w="1234"/>
+          </w:tcPr>
+          <w:p/>
+        </w:tc>
+      </w:tr>
+      <w:tr>
+        <w:tc>
+          <w:tcPr>
+            <w:tcW w:type="dxa" w:w="1234"/>
+          </w:tcPr>
+          <w:p/>
+        </w:tc>
+        <w:tc>
+          <w:tcPr>
+            <w:tcW w:type="dxa" w:w="1234"/>
+          </w:tcPr>
+          <w:p/>
+        </w:tc>
+        <w:tc>
+          <w:tcPr>
+            <w:tcW w:type="dxa" w:w="1234"/>
+          </w:tcPr>
+          <w:p/>
+        </w:tc>
+        <w:tc>
+          <w:tcPr>
+            <w:tcW w:type="dxa" w:w="1234"/>
+          </w:tcPr>
+          <w:p/>
+        </w:tc>
+        <w:tc>
+          <w:tcPr>
+            <w:tcW w:type="dxa" w:w="1234"/>
+          </w:tcPr>
+          <w:p/>
+        </w:tc>
+        <w:tc>
+          <w:tcPr>
+            <w:tcW w:type="dxa" w:w="1234"/>
+          </w:tcPr>
+          <w:p/>
+        </w:tc>
+        <w:tc>
+          <w:tcPr>
+            <w:tcW w:type="dxa" w:w="1234"/>
+          </w:tcPr>
+          <w:p/>
+        </w:tc>
+      </w:tr>
+      <w:tr>
+        <w:tc>
+          <w:tcPr>
+            <w:tcW w:type="dxa" w:w="1234"/>
+          </w:tcPr>
+          <w:p/>
+        </w:tc>
+        <w:tc>
+          <w:tcPr>
+            <w:tcW w:type="dxa" w:w="1234"/>
+          </w:tcPr>
+          <w:p/>
+        </w:tc>
+        <w:tc>
+          <w:tcPr>
+            <w:tcW w:type="dxa" w:w="1234"/>
+          </w:tcPr>
+          <w:p/>
+        </w:tc>
+        <w:tc>
+          <w:tcPr>
+            <w:tcW w:type="dxa" w:w="1234"/>
+          </w:tcPr>
+          <w:p/>
+        </w:tc>
+        <w:tc>
+          <w:tcPr>
+            <w:tcW w:type="dxa" w:w="1234"/>
+          </w:tcPr>
+          <w:p/>
+        </w:tc>
+        <w:tc>
+          <w:tcPr>
+            <w:tcW w:type="dxa" w:w="1234"/>
+          </w:tcPr>
+          <w:p/>
+        </w:tc>
+        <w:tc>
+          <w:tcPr>
+            <w:tcW w:type="dxa" w:w="1234"/>
+          </w:tcPr>
+          <w:p/>
+        </w:tc>
+      </w:tr>
+      <w:tr>
+        <w:tc>
+          <w:tcPr>
+            <w:tcW w:type="dxa" w:w="1234"/>
+          </w:tcPr>
+          <w:p/>
+        </w:tc>
+        <w:tc>
+          <w:tcPr>
+            <w:tcW w:type="dxa" w:w="1234"/>
+          </w:tcPr>
+          <w:p/>
+        </w:tc>
+        <w:tc>
+          <w:tcPr>
+            <w:tcW w:type="dxa" w:w="1234"/>
+          </w:tcPr>
+          <w:p/>
+        </w:tc>
+        <w:tc>
+          <w:tcPr>
+            <w:tcW w:type="dxa" w:w="1234"/>
+          </w:tcPr>
+          <w:p/>
+        </w:tc>
+        <w:tc>
+          <w:tcPr>
+            <w:tcW w:type="dxa" w:w="1234"/>
+          </w:tcPr>
+          <w:p/>
+        </w:tc>
+        <w:tc>
+          <w:tcPr>
+            <w:tcW w:type="dxa" w:w="1234"/>
+          </w:tcPr>
+          <w:p/>
+        </w:tc>
+        <w:tc>
+          <w:tcPr>
+            <w:tcW w:type="dxa" w:w="1234"/>
+          </w:tcPr>
+          <w:p/>
+        </w:tc>
+      </w:tr>
+      <w:tr>
+        <w:tc>
+          <w:tcPr>
+            <w:tcW w:type="dxa" w:w="1234"/>
+          </w:tcPr>
+          <w:p/>
+        </w:tc>
+        <w:tc>
+          <w:tcPr>
+            <w:tcW w:type="dxa" w:w="1234"/>
+          </w:tcPr>
+          <w:p/>
+        </w:tc>
+        <w:tc>
+          <w:tcPr>
+            <w:tcW w:type="dxa" w:w="1234"/>
+          </w:tcPr>
+          <w:p/>
+        </w:tc>
+        <w:tc>
+          <w:tcPr>
+            <w:tcW w:type="dxa" w:w="1234"/>
+          </w:tcPr>
+          <w:p/>
+        </w:tc>
+        <w:tc>
+          <w:tcPr>
+            <w:tcW w:type="dxa" w:w="1234"/>
+          </w:tcPr>
+          <w:p/>
+        </w:tc>
+        <w:tc>
+          <w:tcPr>
+            <w:tcW w:type="dxa" w:w="1234"/>
+          </w:tcPr>
+          <w:p/>
+        </w:tc>
+        <w:tc>
+          <w:tcPr>
+            <w:tcW w:type="dxa" w:w="1234"/>
+          </w:tcPr>
+          <w:p/>
+        </w:tc>
+      </w:tr>
+      <w:tr>
+        <w:tc>
+          <w:tcPr>
+            <w:tcW w:type="dxa" w:w="1234"/>
+          </w:tcPr>
+          <w:p>
+            <w:r>
+              <w:t>1</w:t>
+            </w:r>
+          </w:p>
+        </w:tc>
+        <w:tc>
+          <w:tcPr>
+            <w:tcW w:type="dxa" w:w="1234"/>
+          </w:tcPr>
+          <w:p>
+            <w:r>
+              <w:t>Real-time data (Alpaca streams)</w:t>
+            </w:r>
+          </w:p>
+        </w:tc>
+        <w:tc>
+          <w:tcPr>
+            <w:tcW w:type="dxa" w:w="1234"/>
+          </w:tcPr>
+          <w:p>
+            <w:r>
+              <w:t>Execution</w:t>
+            </w:r>
+          </w:p>
+        </w:tc>
+        <w:tc>
+          <w:tcPr>
+            <w:tcW w:type="dxa" w:w="1234"/>
+          </w:tcPr>
+          <w:p>
+            <w:r>
+              <w:t>Replace yfinance 15-min delay with Alpaca real-time WebSocket feed for price + volume</w:t>
+            </w:r>
+          </w:p>
+        </w:tc>
+        <w:tc>
+          <w:tcPr>
+            <w:tcW w:type="dxa" w:w="1234"/>
+          </w:tcPr>
+          <w:p>
+            <w:r>
+              <w:t>Foundational fix — stale prices cause entry slippage on every trade; free for Alpaca paper accounts</w:t>
+            </w:r>
+          </w:p>
+        </w:tc>
+        <w:tc>
+          <w:tcPr>
+            <w:tcW w:type="dxa" w:w="1234"/>
+          </w:tcPr>
+          <w:p>
+            <w:r>
+              <w:t>M</w:t>
+            </w:r>
+          </w:p>
+        </w:tc>
+        <w:tc>
+          <w:tcPr>
+            <w:tcW w:type="dxa" w:w="1234"/>
+          </w:tcPr>
+          <w:p>
+            <w:r>
+              <w:t>IDEA</w:t>
+            </w:r>
+          </w:p>
+        </w:tc>
+      </w:tr>
+      <w:tr>
+        <w:tc>
+          <w:tcPr>
+            <w:tcW w:type="dxa" w:w="1234"/>
+          </w:tcPr>
+          <w:p>
+            <w:r>
+              <w:t>2</w:t>
+            </w:r>
+          </w:p>
+        </w:tc>
+        <w:tc>
+          <w:tcPr>
+            <w:tcW w:type="dxa" w:w="1234"/>
+          </w:tcPr>
+          <w:p>
+            <w:r>
+              <w:t>Post-earnings momentum agent</w:t>
+            </w:r>
+          </w:p>
+        </w:tc>
+        <w:tc>
+          <w:tcPr>
+            <w:tcW w:type="dxa" w:w="1234"/>
+          </w:tcPr>
+          <w:p>
+            <w:r>
+              <w:t>Information</w:t>
+            </w:r>
+          </w:p>
+        </w:tc>
+        <w:tc>
+          <w:tcPr>
+            <w:tcW w:type="dxa" w:w="1234"/>
+          </w:tcPr>
+          <w:p>
+            <w:r>
+              <w:t>Hunt stocks that beat estimates + raised guidance in last 48h; enter 1-2 days after report</w:t>
+            </w:r>
+          </w:p>
+        </w:tc>
+        <w:tc>
+          <w:tcPr>
+            <w:tcW w:type="dxa" w:w="1234"/>
+          </w:tcPr>
+          <w:p>
+            <w:r>
+              <w:t>Post-earnings announcement drift (PEAD) is one of the most persistent anomalies in academic finance; current blackout throws this edge away</w:t>
+            </w:r>
+          </w:p>
+        </w:tc>
+        <w:tc>
+          <w:tcPr>
+            <w:tcW w:type="dxa" w:w="1234"/>
+          </w:tcPr>
+          <w:p>
+            <w:r>
+              <w:t>M</w:t>
+            </w:r>
+          </w:p>
+        </w:tc>
+        <w:tc>
+          <w:tcPr>
+            <w:tcW w:type="dxa" w:w="1234"/>
+          </w:tcPr>
+          <w:p>
+            <w:r>
+              <w:t>IDEA</w:t>
+            </w:r>
+          </w:p>
+        </w:tc>
+      </w:tr>
+      <w:tr>
+        <w:tc>
+          <w:tcPr>
+            <w:tcW w:type="dxa" w:w="1234"/>
+          </w:tcPr>
+          <w:p>
+            <w:r>
+              <w:t>3</w:t>
+            </w:r>
+          </w:p>
+        </w:tc>
+        <w:tc>
+          <w:tcPr>
+            <w:tcW w:type="dxa" w:w="1234"/>
+          </w:tcPr>
+          <w:p>
+            <w:r>
+              <w:t>Market regime classifier</w:t>
+            </w:r>
+          </w:p>
+        </w:tc>
+        <w:tc>
+          <w:tcPr>
+            <w:tcW w:type="dxa" w:w="1234"/>
+          </w:tcPr>
+          <w:p>
+            <w:r>
+              <w:t>Analytical</w:t>
+            </w:r>
+          </w:p>
+        </w:tc>
+        <w:tc>
+          <w:tcPr>
+            <w:tcW w:type="dxa" w:w="1234"/>
+          </w:tcPr>
+          <w:p>
+            <w:r>
+              <w:t>Classify each day as Trending / Choppy / Volatile using VIX, market breadth, sector dispersion; switch strategy or skip accordingly</w:t>
+            </w:r>
+          </w:p>
+        </w:tc>
+        <w:tc>
+          <w:tcPr>
+            <w:tcW w:type="dxa" w:w="1234"/>
+          </w:tcPr>
+          <w:p>
+            <w:r>
+              <w:t>Momentum signals work in trending markets and generate false signals in choppy ones; knowing the regime dramatically improves when to trade</w:t>
+            </w:r>
+          </w:p>
+        </w:tc>
+        <w:tc>
+          <w:tcPr>
+            <w:tcW w:type="dxa" w:w="1234"/>
+          </w:tcPr>
+          <w:p>
+            <w:r>
+              <w:t>M</w:t>
+            </w:r>
+          </w:p>
+        </w:tc>
+        <w:tc>
+          <w:tcPr>
+            <w:tcW w:type="dxa" w:w="1234"/>
+          </w:tcPr>
+          <w:p>
+            <w:r>
+              <w:t>IDEA</w:t>
+            </w:r>
+          </w:p>
+        </w:tc>
+      </w:tr>
+      <w:tr>
+        <w:tc>
+          <w:tcPr>
+            <w:tcW w:type="dxa" w:w="1234"/>
+          </w:tcPr>
+          <w:p>
+            <w:r>
+              <w:t>4</w:t>
+            </w:r>
+          </w:p>
+        </w:tc>
+        <w:tc>
+          <w:tcPr>
+            <w:tcW w:type="dxa" w:w="1234"/>
+          </w:tcPr>
+          <w:p>
+            <w:r>
+              <w:t>Options flow signal</w:t>
+            </w:r>
+          </w:p>
+        </w:tc>
+        <w:tc>
+          <w:tcPr>
+            <w:tcW w:type="dxa" w:w="1234"/>
+          </w:tcPr>
+          <w:p>
+            <w:r>
+              <w:t>Information</w:t>
+            </w:r>
+          </w:p>
+        </w:tc>
+        <w:tc>
+          <w:tcPr>
+            <w:tcW w:type="dxa" w:w="1234"/>
+          </w:tcPr>
+          <w:p>
+            <w:r>
+              <w:t>Pull unusual options activity (large call buying relative to open interest) for candidates; boost score for tickers with informed positioning</w:t>
+            </w:r>
+          </w:p>
+        </w:tc>
+        <w:tc>
+          <w:tcPr>
+            <w:tcW w:type="dxa" w:w="1234"/>
+          </w:tcPr>
+          <w:p>
+            <w:r>
+              <w:t>Unusual options activity consistently precedes price moves; represents informed institutional money moving before a catalyst — genuinely non-commodity information</w:t>
+            </w:r>
+          </w:p>
+        </w:tc>
+        <w:tc>
+          <w:tcPr>
+            <w:tcW w:type="dxa" w:w="1234"/>
+          </w:tcPr>
+          <w:p>
+            <w:r>
+              <w:t>L</w:t>
+            </w:r>
+          </w:p>
+        </w:tc>
+        <w:tc>
+          <w:tcPr>
+            <w:tcW w:type="dxa" w:w="1234"/>
+          </w:tcPr>
+          <w:p>
+            <w:r>
+              <w:t>BACKLOG</w:t>
+            </w:r>
+          </w:p>
+        </w:tc>
+      </w:tr>
+      <w:tr>
+        <w:tc>
+          <w:tcPr>
+            <w:tcW w:type="dxa" w:w="1234"/>
+          </w:tcPr>
+          <w:p>
+            <w:r>
+              <w:t>5</w:t>
+            </w:r>
+          </w:p>
+        </w:tc>
+        <w:tc>
+          <w:tcPr>
+            <w:tcW w:type="dxa" w:w="1234"/>
+          </w:tcPr>
+          <w:p>
+            <w:r>
+              <w:t>Insider buying scan (Form 4)</w:t>
+            </w:r>
+          </w:p>
+        </w:tc>
+        <w:tc>
+          <w:tcPr>
+            <w:tcW w:type="dxa" w:w="1234"/>
+          </w:tcPr>
+          <w:p>
+            <w:r>
+              <w:t>Information</w:t>
+            </w:r>
+          </w:p>
+        </w:tc>
+        <w:tc>
+          <w:tcPr>
+            <w:tcW w:type="dxa" w:w="1234"/>
+          </w:tcPr>
+          <w:p>
+            <w:r>
+              <w:t>Weekly scan of SEC EDGAR Form 4 filings; flag tickers with cluster buys (3+ insiders buying in same week)</w:t>
+            </w:r>
+          </w:p>
+        </w:tc>
+        <w:tc>
+          <w:tcPr>
+            <w:tcW w:type="dxa" w:w="1234"/>
+          </w:tcPr>
+          <w:p>
+            <w:r>
+              <w:t>Executive buying of own stock is historically one of the strongest retail-accessible signals; free public data that most retail systems never use</w:t>
+            </w:r>
+          </w:p>
+        </w:tc>
+        <w:tc>
+          <w:tcPr>
+            <w:tcW w:type="dxa" w:w="1234"/>
+          </w:tcPr>
+          <w:p>
+            <w:r>
+              <w:t>M</w:t>
+            </w:r>
+          </w:p>
+        </w:tc>
+        <w:tc>
+          <w:tcPr>
+            <w:tcW w:type="dxa" w:w="1234"/>
+          </w:tcPr>
+          <w:p>
+            <w:r>
+              <w:t>IDEA</w:t>
+            </w:r>
+          </w:p>
+        </w:tc>
+      </w:tr>
+      <w:tr>
+        <w:tc>
+          <w:tcPr>
+            <w:tcW w:type="dxa" w:w="1234"/>
+          </w:tcPr>
+          <w:p>
+            <w:r>
+              <w:t>6</w:t>
+            </w:r>
+          </w:p>
+        </w:tc>
+        <w:tc>
+          <w:tcPr>
+            <w:tcW w:type="dxa" w:w="1234"/>
+          </w:tcPr>
+          <w:p>
+            <w:r>
+              <w:t>Claude on earnings transcripts</w:t>
+            </w:r>
+          </w:p>
+        </w:tc>
+        <w:tc>
+          <w:tcPr>
+            <w:tcW w:type="dxa" w:w="1234"/>
+          </w:tcPr>
+          <w:p>
+            <w:r>
+              <w:t>Analytical</w:t>
+            </w:r>
+          </w:p>
+        </w:tc>
+        <w:tc>
+          <w:tcPr>
+            <w:tcW w:type="dxa" w:w="1234"/>
+          </w:tcPr>
+          <w:p>
+            <w:r>
+              <w:t>Feed Claude actual earnings call text; extract tone, guidance language, management confidence beyond what the headline EPS number shows</w:t>
+            </w:r>
+          </w:p>
+        </w:tc>
+        <w:tc>
+          <w:tcPr>
+            <w:tcW w:type="dxa" w:w="1234"/>
+          </w:tcPr>
+          <w:p>
+            <w:r>
+              <w:t>True LLM value-add — qualitative signals that quant models cannot capture; analyst surprise is often in the language, not just the numbers</w:t>
+            </w:r>
+          </w:p>
+        </w:tc>
+        <w:tc>
+          <w:tcPr>
+            <w:tcW w:type="dxa" w:w="1234"/>
+          </w:tcPr>
+          <w:p>
+            <w:r>
+              <w:t>L</w:t>
+            </w:r>
+          </w:p>
+        </w:tc>
+        <w:tc>
+          <w:tcPr>
+            <w:tcW w:type="dxa" w:w="1234"/>
+          </w:tcPr>
+          <w:p>
+            <w:r>
+              <w:t>BACKLOG</w:t>
+            </w:r>
+          </w:p>
+        </w:tc>
+      </w:tr>
+    </w:tbl>
+    <w:p/>
+    <w:p>
+      <w:pPr>
+        <w:pStyle w:val="Heading2"/>
+      </w:pPr>
+      <w:r>
+        <w:rPr>
+          <w:color w:val="1A3A6A"/>
+        </w:rPr>
+        <w:t>Realistic Ceiling With Real Edge Added</w:t>
+      </w:r>
+    </w:p>
+    <w:p>
+      <w:pPr>
+        <w:spacing w:after="120"/>
+      </w:pPr>
+      <w:r>
+        <w:t>Even with all of the above, this remains a retail system. Realistic ceiling with full edge stack in a favorable market: $500–800/day real money. The regime classifier (item 3) is the highest-leverage single feature — it prevents trading on days where the signals do not work, which is where most losses come from. Validate paper trading for 30 days before deploying any real capital.</w:t>
+      </w:r>
+    </w:p>
+    <w:p>
+      <w:r>
+        <w:br w:type="page"/>
+      </w:r>
+    </w:p>
+    <w:p>
+      <w:pPr>
+        <w:pStyle w:val="Heading1"/>
+      </w:pPr>
+      <w:r>
+        <w:rPr>
+          <w:color w:val="1A3A6A"/>
+        </w:rPr>
+        <w:t>10. Priority Summary — What to Build Next</w:t>
       </w:r>
     </w:p>
     <w:p>

</xml_diff>

<commit_message>
plan: native trailing stop marked P0 backlog + pre-real-money checklist added
Co-Authored-By: Claude Sonnet 4.6 <noreply@anthropic.com>
</commit_message>
<xml_diff>
--- a/Trading_Agent_Features.docx
+++ b/Trading_Agent_Features.docx
@@ -3417,7 +3417,7 @@
           </w:tcPr>
           <w:p>
             <w:r>
-              <w:t>Time-of-day entry filter</w:t>
+              <w:t>Time-of-day entry filter (skip first 15 min)</w:t>
             </w:r>
           </w:p>
         </w:tc>
@@ -3467,7 +3467,7 @@
           </w:tcPr>
           <w:p>
             <w:r>
-              <w:t>IDEA</w:t>
+              <w:t>SHIPPED</w:t>
             </w:r>
           </w:p>
         </w:tc>
@@ -3489,7 +3489,7 @@
           </w:tcPr>
           <w:p>
             <w:r>
-              <w:t>Submit limit buy slightly below current price instead of market order</w:t>
+              <w:t>Submit limit buy at entry_price × 1.001 instead of market order</w:t>
             </w:r>
           </w:p>
         </w:tc>
@@ -3519,17 +3519,17 @@
           </w:tcPr>
           <w:p>
             <w:r>
-              <w:t>P2</w:t>
-            </w:r>
-          </w:p>
-        </w:tc>
-        <w:tc>
-          <w:tcPr>
-            <w:tcW w:type="dxa" w:w="1440"/>
-          </w:tcPr>
-          <w:p>
-            <w:r>
-              <w:t>IDEA</w:t>
+              <w:t>P1</w:t>
+            </w:r>
+          </w:p>
+        </w:tc>
+        <w:tc>
+          <w:tcPr>
+            <w:tcW w:type="dxa" w:w="1440"/>
+          </w:tcPr>
+          <w:p>
+            <w:r>
+              <w:t>SHIPPED</w:t>
             </w:r>
           </w:p>
         </w:tc>
@@ -3603,59 +3603,55 @@
           </w:tcPr>
           <w:p>
             <w:r>
-              <w:t>Trailing stop Alpaca native order</w:t>
-            </w:r>
-          </w:p>
-        </w:tc>
-        <w:tc>
-          <w:tcPr>
-            <w:tcW w:type="dxa" w:w="1440"/>
-          </w:tcPr>
-          <w:p>
-            <w:r>
-              <w:t>Replace manual close_position() trail check with Alpaca's native trailing stop order</w:t>
-            </w:r>
-          </w:p>
-        </w:tc>
-        <w:tc>
-          <w:tcPr>
-            <w:tcW w:type="dxa" w:w="1440"/>
-          </w:tcPr>
-          <w:p>
-            <w:r>
-              <w:t>Native trailing stop fires immediately on price move; our 30-min check can miss a fast reversal</w:t>
-            </w:r>
-          </w:p>
-        </w:tc>
-        <w:tc>
-          <w:tcPr>
-            <w:tcW w:type="dxa" w:w="1440"/>
-          </w:tcPr>
-          <w:p>
-            <w:r>
-              <w:t>M</w:t>
-            </w:r>
-          </w:p>
-        </w:tc>
-        <w:tc>
-          <w:tcPr>
-            <w:tcW w:type="dxa" w:w="1440"/>
-          </w:tcPr>
-          <w:p>
-            <w:r>
-              <w:t>P2</w:t>
-            </w:r>
-          </w:p>
-        </w:tc>
-        <w:tc>
-          <w:tcPr>
-            <w:tcW w:type="dxa" w:w="1440"/>
-          </w:tcPr>
-          <w:p>
-            <w:r>
-              <w:t>IDEA</w:t>
-            </w:r>
-          </w:p>
+              <w:t>Native Alpaca trailing stop (OTO-OCO) — REQUIRED BEFORE REAL MONEY</w:t>
+            </w:r>
+          </w:p>
+        </w:tc>
+        <w:tc>
+          <w:tcPr>
+            <w:tcW w:type="dxa" w:w="1440"/>
+          </w:tcPr>
+          <w:p>
+            <w:r>
+              <w:t>Replace bracket order with OTO-OCO: limit entry → OCO (take-profit + trail_percent=1.0). Current 15-min polling can miss fast reversals; native stop fires in real-time. Risks: gap window (unprotected between fill and OCO submit), double-sell, OCO failure. Mitigation: USE_NATIVE_TRAILING_STOP feature flag, entry_filled_at DB column, idempotent OCO guard, unit tests with mocked Alpaca client, 2-week paper A/B before enabling.</w:t>
+            </w:r>
+          </w:p>
+        </w:tc>
+        <w:tc>
+          <w:tcPr>
+            <w:tcW w:type="dxa" w:w="1440"/>
+          </w:tcPr>
+          <w:p>
+            <w:r>
+              <w:t>L</w:t>
+            </w:r>
+          </w:p>
+        </w:tc>
+        <w:tc>
+          <w:tcPr>
+            <w:tcW w:type="dxa" w:w="1440"/>
+          </w:tcPr>
+          <w:p>
+            <w:r>
+              <w:t>P0</w:t>
+            </w:r>
+          </w:p>
+        </w:tc>
+        <w:tc>
+          <w:tcPr>
+            <w:tcW w:type="dxa" w:w="1440"/>
+          </w:tcPr>
+          <w:p>
+            <w:r>
+              <w:t>BACKLOG</w:t>
+            </w:r>
+          </w:p>
+        </w:tc>
+        <w:tc>
+          <w:tcPr>
+            <w:tcW w:type="dxa" w:w="1440"/>
+          </w:tcPr>
+          <w:p/>
         </w:tc>
       </w:tr>
     </w:tbl>

</xml_diff>

<commit_message>
docs: add P0 pre-go-live item — P&L reconciliation against Alpaca equity
Co-Authored-By: Claude Sonnet 4.6 <noreply@anthropic.com>
</commit_message>
<xml_diff>
--- a/Trading_Agent_Features.docx
+++ b/Trading_Agent_Features.docx
@@ -5053,6 +5053,106 @@
             <w:tcW w:type="dxa" w:w="1440"/>
           </w:tcPr>
           <w:p/>
+        </w:tc>
+      </w:tr>
+      <w:tr>
+        <w:tc>
+          <w:tcPr>
+            <w:tcW w:type="dxa" w:w="1440"/>
+          </w:tcPr>
+          <w:p/>
+        </w:tc>
+        <w:tc>
+          <w:tcPr>
+            <w:tcW w:type="dxa" w:w="1440"/>
+          </w:tcPr>
+          <w:p/>
+        </w:tc>
+        <w:tc>
+          <w:tcPr>
+            <w:tcW w:type="dxa" w:w="1440"/>
+          </w:tcPr>
+          <w:p/>
+        </w:tc>
+        <w:tc>
+          <w:tcPr>
+            <w:tcW w:type="dxa" w:w="1440"/>
+          </w:tcPr>
+          <w:p/>
+        </w:tc>
+        <w:tc>
+          <w:tcPr>
+            <w:tcW w:type="dxa" w:w="1440"/>
+          </w:tcPr>
+          <w:p/>
+        </w:tc>
+        <w:tc>
+          <w:tcPr>
+            <w:tcW w:type="dxa" w:w="1440"/>
+          </w:tcPr>
+          <w:p/>
+        </w:tc>
+      </w:tr>
+      <w:tr>
+        <w:tc>
+          <w:tcPr>
+            <w:tcW w:type="dxa" w:w="1440"/>
+          </w:tcPr>
+          <w:p>
+            <w:r>
+              <w:t>P&amp;L reconciliation against Alpaca equity — PRE GO-LIVE</w:t>
+            </w:r>
+          </w:p>
+        </w:tc>
+        <w:tc>
+          <w:tcPr>
+            <w:tcW w:type="dxa" w:w="1440"/>
+          </w:tcPr>
+          <w:p>
+            <w:r>
+              <w:t>At EOD, pull Alpaca account equity directly (get_account().equity) instead of computing P&amp;L from fill prices. Use Alpaca equity as the source of truth for ending_capital and realized_pnl. Current approach: shares × (close_price − entry_price) + starting_capital. Known gap: paper account showed $100,064.67 (Alpaca) vs $100,128.29 (our calc) on Day 1 — $63.62 discrepancy from commissions, slippage, and limit order fill differences.</w:t>
+            </w:r>
+          </w:p>
+        </w:tc>
+        <w:tc>
+          <w:tcPr>
+            <w:tcW w:type="dxa" w:w="1440"/>
+          </w:tcPr>
+          <w:p>
+            <w:r>
+              <w:t>On real capital, a $63 discrepancy per day compounds. Books must match the broker exactly. Alpaca equity is always ground truth — our P&amp;L calc is an approximation.</w:t>
+            </w:r>
+          </w:p>
+        </w:tc>
+        <w:tc>
+          <w:tcPr>
+            <w:tcW w:type="dxa" w:w="1440"/>
+          </w:tcPr>
+          <w:p>
+            <w:r>
+              <w:t>S</w:t>
+            </w:r>
+          </w:p>
+        </w:tc>
+        <w:tc>
+          <w:tcPr>
+            <w:tcW w:type="dxa" w:w="1440"/>
+          </w:tcPr>
+          <w:p>
+            <w:r>
+              <w:t>P0</w:t>
+            </w:r>
+          </w:p>
+        </w:tc>
+        <w:tc>
+          <w:tcPr>
+            <w:tcW w:type="dxa" w:w="1440"/>
+          </w:tcPr>
+          <w:p>
+            <w:r>
+              <w:t>PLANNED — must fix before real money</w:t>
+            </w:r>
+          </w:p>
         </w:tc>
       </w:tr>
       <w:tr>
@@ -9878,51 +9978,31 @@
           <w:tcPr>
             <w:tcW w:type="dxa" w:w="1728"/>
           </w:tcPr>
-          <w:p>
-            <w:r>
-              <w:t>—</w:t>
-            </w:r>
-          </w:p>
+          <w:p/>
         </w:tc>
         <w:tc>
           <w:tcPr>
             <w:tcW w:type="dxa" w:w="1728"/>
           </w:tcPr>
-          <w:p>
-            <w:r>
-              <w:t>ML candidate scorer (step 1.76)</w:t>
-            </w:r>
-          </w:p>
+          <w:p/>
         </w:tc>
         <w:tc>
           <w:tcPr>
             <w:tcW w:type="dxa" w:w="1728"/>
           </w:tcPr>
-          <w:p>
-            <w:r>
-              <w:t>Signal Quality</w:t>
-            </w:r>
-          </w:p>
+          <w:p/>
         </w:tc>
         <w:tc>
           <w:tcPr>
             <w:tcW w:type="dxa" w:w="1728"/>
           </w:tcPr>
-          <w:p>
-            <w:r>
-              <w:t>M</w:t>
-            </w:r>
-          </w:p>
+          <w:p/>
         </w:tc>
         <w:tc>
           <w:tcPr>
             <w:tcW w:type="dxa" w:w="1728"/>
           </w:tcPr>
-          <w:p>
-            <w:r>
-              <w:t>SHIPPED v5.5 — sorts candidates by P(hit +2%) before Claude; AUC 0.78</w:t>
-            </w:r>
-          </w:p>
+          <w:p/>
         </w:tc>
       </w:tr>
       <w:tr>
@@ -9942,7 +10022,7 @@
           </w:tcPr>
           <w:p>
             <w:r>
-              <w:t>Target 2% / stop 0.67% (3:1 R:R)</w:t>
+              <w:t>ML candidate scorer (step 1.76)</w:t>
             </w:r>
           </w:p>
         </w:tc>
@@ -9952,7 +10032,7 @@
           </w:tcPr>
           <w:p>
             <w:r>
-              <w:t>Risk Mgmt</w:t>
+              <w:t>Signal Quality</w:t>
             </w:r>
           </w:p>
         </w:tc>
@@ -9962,7 +10042,7 @@
           </w:tcPr>
           <w:p>
             <w:r>
-              <w:t>XS</w:t>
+              <w:t>M</w:t>
             </w:r>
           </w:p>
         </w:tc>
@@ -9972,7 +10052,7 @@
           </w:tcPr>
           <w:p>
             <w:r>
-              <w:t>SHIPPED v5.5 — lower achievable target; break-even at 25% win rate</w:t>
+              <w:t>SHIPPED v5.5 — sorts candidates by P(hit +2%) before Claude; AUC 0.78</w:t>
             </w:r>
           </w:p>
         </w:tc>
@@ -9994,7 +10074,7 @@
           </w:tcPr>
           <w:p>
             <w:r>
-              <w:t>Time-of-day entry filter (9:45 AM ET)</w:t>
+              <w:t>Target 2% / stop 0.67% (3:1 R:R)</w:t>
             </w:r>
           </w:p>
         </w:tc>
@@ -10004,7 +10084,7 @@
           </w:tcPr>
           <w:p>
             <w:r>
-              <w:t>Execution</w:t>
+              <w:t>Risk Mgmt</w:t>
             </w:r>
           </w:p>
         </w:tc>
@@ -10024,7 +10104,7 @@
           </w:tcPr>
           <w:p>
             <w:r>
-              <w:t>SHIPPED v5.4 — skips noisiest first 15 min of market</w:t>
+              <w:t>SHIPPED v5.5 — lower achievable target; break-even at 25% win rate</w:t>
             </w:r>
           </w:p>
         </w:tc>
@@ -10046,7 +10126,7 @@
           </w:tcPr>
           <w:p>
             <w:r>
-              <w:t>Live price refresh (Alpaca ask prices)</w:t>
+              <w:t>Time-of-day entry filter (9:45 AM ET)</w:t>
             </w:r>
           </w:p>
         </w:tc>
@@ -10066,7 +10146,7 @@
           </w:tcPr>
           <w:p>
             <w:r>
-              <w:t>S</w:t>
+              <w:t>XS</w:t>
             </w:r>
           </w:p>
         </w:tc>
@@ -10076,7 +10156,7 @@
           </w:tcPr>
           <w:p>
             <w:r>
-              <w:t>SHIPPED v5.4 — real-time ask prices replace 15-min stale yfinance at step 1.8</w:t>
+              <w:t>SHIPPED v5.4 — skips noisiest first 15 min of market</w:t>
             </w:r>
           </w:p>
         </w:tc>
@@ -10098,7 +10178,7 @@
           </w:tcPr>
           <w:p>
             <w:r>
-              <w:t>Native Alpaca trailing stop</w:t>
+              <w:t>Live price refresh (Alpaca ask prices)</w:t>
             </w:r>
           </w:p>
         </w:tc>
@@ -10118,7 +10198,7 @@
           </w:tcPr>
           <w:p>
             <w:r>
-              <w:t>L</w:t>
+              <w:t>S</w:t>
             </w:r>
           </w:p>
         </w:tc>
@@ -10128,7 +10208,7 @@
           </w:tcPr>
           <w:p>
             <w:r>
-              <w:t>SHIPPED v5.6 — trail_percent bracket leg; 2-week paper gate closes 2026-06-01</w:t>
+              <w:t>SHIPPED v5.4 — real-time ask prices replace 15-min stale yfinance at step 1.8</w:t>
             </w:r>
           </w:p>
         </w:tc>
@@ -10150,7 +10230,7 @@
           </w:tcPr>
           <w:p>
             <w:r>
-              <w:t>Tiered lock-in — Thread 2</w:t>
+              <w:t>Native Alpaca trailing stop</w:t>
             </w:r>
           </w:p>
         </w:tc>
@@ -10160,7 +10240,7 @@
           </w:tcPr>
           <w:p>
             <w:r>
-              <w:t>Position Mgmt</w:t>
+              <w:t>Execution</w:t>
             </w:r>
           </w:p>
         </w:tc>
@@ -10170,7 +10250,7 @@
           </w:tcPr>
           <w:p>
             <w:r>
-              <w:t>S</w:t>
+              <w:t>L</w:t>
             </w:r>
           </w:p>
         </w:tc>
@@ -10180,7 +10260,7 @@
           </w:tcPr>
           <w:p>
             <w:r>
-              <w:t>SHIPPED v5.7 — Tier 1 $716 ride with tighter trail, Tier 2 $1,000 ceiling close</w:t>
+              <w:t>SHIPPED v5.6 — trail_percent bracket leg; 2-week paper gate closes 2026-06-01</w:t>
             </w:r>
           </w:p>
         </w:tc>
@@ -10202,7 +10282,7 @@
           </w:tcPr>
           <w:p>
             <w:r>
-              <w:t>VWAP + RS vs SPY enrichment — Thread 1</w:t>
+              <w:t>Tiered lock-in — Thread 2</w:t>
             </w:r>
           </w:p>
         </w:tc>
@@ -10212,7 +10292,7 @@
           </w:tcPr>
           <w:p>
             <w:r>
-              <w:t>Signal Quality</w:t>
+              <w:t>Position Mgmt</w:t>
             </w:r>
           </w:p>
         </w:tc>
@@ -10232,7 +10312,7 @@
           </w:tcPr>
           <w:p>
             <w:r>
-              <w:t>SHIPPED v5.7 — step 1.85 enriches candidates with live institutional signals before Claude</w:t>
+              <w:t>SHIPPED v5.7 — Tier 1 $716 ride with tighter trail, Tier 2 $1,000 ceiling close</w:t>
             </w:r>
           </w:p>
         </w:tc>
@@ -10254,7 +10334,7 @@
           </w:tcPr>
           <w:p>
             <w:r>
-              <w:t>Manual override stop/restart</w:t>
+              <w:t>VWAP + RS vs SPY enrichment — Thread 1</w:t>
             </w:r>
           </w:p>
         </w:tc>
@@ -10264,7 +10344,7 @@
           </w:tcPr>
           <w:p>
             <w:r>
-              <w:t>Operational</w:t>
+              <w:t>Signal Quality</w:t>
             </w:r>
           </w:p>
         </w:tc>
@@ -10284,7 +10364,7 @@
           </w:tcPr>
           <w:p>
             <w:r>
-              <w:t>SHIPPED v5.7 — control.py + stop.yml + restart.yml; halt banner on every dashboard page</w:t>
+              <w:t>SHIPPED v5.7 — step 1.85 enriches candidates with live institutional signals before Claude</w:t>
             </w:r>
           </w:p>
         </w:tc>
@@ -10306,7 +10386,7 @@
           </w:tcPr>
           <w:p>
             <w:r>
-              <w:t>Halt history + eval markers</w:t>
+              <w:t>Manual override stop/restart</w:t>
             </w:r>
           </w:p>
         </w:tc>
@@ -10336,7 +10416,7 @@
           </w:tcPr>
           <w:p>
             <w:r>
-              <w:t>SHIPPED v5.7 — halt_flag_cleared + resumed_at; vline chart markers; INTEGRITY CHECKS in eval</w:t>
+              <w:t>SHIPPED v5.7 — control.py + stop.yml + restart.yml; halt banner on every dashboard page</w:t>
             </w:r>
           </w:p>
         </w:tc>
@@ -10358,7 +10438,7 @@
           </w:tcPr>
           <w:p>
             <w:r>
-              <w:t>Daily EOD summary (Claude Haiku)</w:t>
+              <w:t>Halt history + eval markers</w:t>
             </w:r>
           </w:p>
         </w:tc>
@@ -10368,7 +10448,7 @@
           </w:tcPr>
           <w:p>
             <w:r>
-              <w:t>Dashboard</w:t>
+              <w:t>Operational</w:t>
             </w:r>
           </w:p>
         </w:tc>
@@ -10388,7 +10468,7 @@
           </w:tcPr>
           <w:p>
             <w:r>
-              <w:t>SHIPPED v5.8 — plain-English session narrative in Performance tab after every EOD</w:t>
+              <w:t>SHIPPED v5.7 — halt_flag_cleared + resumed_at; vline chart markers; INTEGRITY CHECKS in eval</w:t>
             </w:r>
           </w:p>
         </w:tc>
@@ -10410,7 +10490,7 @@
           </w:tcPr>
           <w:p>
             <w:r>
-              <w:t>Live scorecard + dynamic date range</w:t>
+              <w:t>Daily EOD summary (Claude Haiku)</w:t>
             </w:r>
           </w:p>
         </w:tc>
@@ -10430,7 +10510,7 @@
           </w:tcPr>
           <w:p>
             <w:r>
-              <w:t>XS</w:t>
+              <w:t>S</w:t>
             </w:r>
           </w:p>
         </w:tc>
@@ -10440,7 +10520,7 @@
           </w:tcPr>
           <w:p>
             <w:r>
-              <w:t>SHIPPED v5.8 — scorecard computes from selected date range; options hidden until data threshold met</w:t>
+              <w:t>SHIPPED v5.8 — plain-English session narrative in Performance tab after every EOD</w:t>
             </w:r>
           </w:p>
         </w:tc>
@@ -10462,6 +10542,58 @@
           </w:tcPr>
           <w:p>
             <w:r>
+              <w:t>Live scorecard + dynamic date range</w:t>
+            </w:r>
+          </w:p>
+        </w:tc>
+        <w:tc>
+          <w:tcPr>
+            <w:tcW w:type="dxa" w:w="1728"/>
+          </w:tcPr>
+          <w:p>
+            <w:r>
+              <w:t>Dashboard</w:t>
+            </w:r>
+          </w:p>
+        </w:tc>
+        <w:tc>
+          <w:tcPr>
+            <w:tcW w:type="dxa" w:w="1728"/>
+          </w:tcPr>
+          <w:p>
+            <w:r>
+              <w:t>XS</w:t>
+            </w:r>
+          </w:p>
+        </w:tc>
+        <w:tc>
+          <w:tcPr>
+            <w:tcW w:type="dxa" w:w="1728"/>
+          </w:tcPr>
+          <w:p>
+            <w:r>
+              <w:t>SHIPPED v5.8 — scorecard computes from selected date range; options hidden until data threshold met</w:t>
+            </w:r>
+          </w:p>
+        </w:tc>
+      </w:tr>
+      <w:tr>
+        <w:tc>
+          <w:tcPr>
+            <w:tcW w:type="dxa" w:w="1728"/>
+          </w:tcPr>
+          <w:p>
+            <w:r>
+              <w:t>—</w:t>
+            </w:r>
+          </w:p>
+        </w:tc>
+        <w:tc>
+          <w:tcPr>
+            <w:tcW w:type="dxa" w:w="1728"/>
+          </w:tcPr>
+          <w:p>
+            <w:r>
               <w:t>Performance tab UX (Total Return, tooltips, charts)</w:t>
             </w:r>
           </w:p>
@@ -10493,6 +10625,58 @@
           <w:p>
             <w:r>
               <w:t>SHIPPED v5.8 — side-by-side charts, help= tooltips, plain-text Verdict, Total Return metric</w:t>
+            </w:r>
+          </w:p>
+        </w:tc>
+      </w:tr>
+      <w:tr>
+        <w:tc>
+          <w:tcPr>
+            <w:tcW w:type="dxa" w:w="1728"/>
+          </w:tcPr>
+          <w:p>
+            <w:r>
+              <w:t>P0</w:t>
+            </w:r>
+          </w:p>
+        </w:tc>
+        <w:tc>
+          <w:tcPr>
+            <w:tcW w:type="dxa" w:w="1728"/>
+          </w:tcPr>
+          <w:p>
+            <w:r>
+              <w:t>P&amp;L reconciliation vs Alpaca equity</w:t>
+            </w:r>
+          </w:p>
+        </w:tc>
+        <w:tc>
+          <w:tcPr>
+            <w:tcW w:type="dxa" w:w="1728"/>
+          </w:tcPr>
+          <w:p>
+            <w:r>
+              <w:t>Infrastructure</w:t>
+            </w:r>
+          </w:p>
+        </w:tc>
+        <w:tc>
+          <w:tcPr>
+            <w:tcW w:type="dxa" w:w="1728"/>
+          </w:tcPr>
+          <w:p>
+            <w:r>
+              <w:t>S</w:t>
+            </w:r>
+          </w:p>
+        </w:tc>
+        <w:tc>
+          <w:tcPr>
+            <w:tcW w:type="dxa" w:w="1728"/>
+          </w:tcPr>
+          <w:p>
+            <w:r>
+              <w:t>MUST FIX before real money — $63 gap on Day 1; pull Alpaca equity at EOD as source of truth</w:t>
             </w:r>
           </w:p>
         </w:tc>

</xml_diff>